<commit_message>
:truck: Move & Rename folders files (2)
</commit_message>
<xml_diff>
--- a/Activity_VIII-Network_Security_II/Activity_VIII(Solution).docx
+++ b/Activity_VIII-Network_Security_II/Activity_VIII(Solution).docx
@@ -20,12 +20,83 @@
     <w:p>
       <w:pPr>
         <w:pStyle w:val="NormalWeb"/>
-        <w:shd w:val="clear" w:color="auto" w:fill="FFFFFF"/>
-        <w:rPr>
-          <w:rFonts w:ascii="PalatinoLTPro" w:hAnsi="PalatinoLTPro"/>
-          <w:lang w:val="en-US"/>
-        </w:rPr>
-      </w:pPr>
+        <w:numPr>
+          <w:ilvl w:val="0"/>
+          <w:numId w:val="2"/>
+        </w:numPr>
+        <w:shd w:val="clear" w:color="auto" w:fill="FFFFFF"/>
+        <w:rPr>
+          <w:rFonts w:ascii="Angsana New" w:hAnsi="Angsana New" w:cs="Angsana New"/>
+          <w:b/>
+          <w:bCs/>
+          <w:color w:val="0070C0"/>
+          <w:sz w:val="32"/>
+          <w:szCs w:val="32"/>
+          <w:lang w:val="en-US"/>
+        </w:rPr>
+      </w:pPr>
+      <w:r>
+        <w:rPr>
+          <w:rFonts w:ascii="Angsana New" w:hAnsi="Angsana New" w:cs="Angsana New"/>
+          <w:b/>
+          <w:bCs/>
+          <w:color w:val="0070C0"/>
+          <w:sz w:val="32"/>
+          <w:szCs w:val="32"/>
+          <w:lang w:val="en-US"/>
+        </w:rPr>
+        <w:t xml:space="preserve">IP address </w:t>
+      </w:r>
+      <w:r>
+        <w:rPr>
+          <w:rFonts w:ascii="Angsana New" w:hAnsi="Angsana New" w:cs="Angsana New"/>
+          <w:b/>
+          <w:bCs/>
+          <w:color w:val="0070C0"/>
+          <w:sz w:val="32"/>
+          <w:szCs w:val="32"/>
+          <w:cs/>
+          <w:lang w:val="en-US"/>
+        </w:rPr>
+        <w:t xml:space="preserve">ของผู้โจมตีจะ </w:t>
+      </w:r>
+      <w:r>
+        <w:rPr>
+          <w:rFonts w:ascii="Angsana New" w:hAnsi="Angsana New" w:cs="Angsana New"/>
+          <w:b/>
+          <w:bCs/>
+          <w:color w:val="0070C0"/>
+          <w:sz w:val="32"/>
+          <w:szCs w:val="32"/>
+          <w:lang w:val="en-US"/>
+        </w:rPr>
+        <w:t xml:space="preserve">random </w:t>
+      </w:r>
+      <w:r>
+        <w:rPr>
+          <w:rFonts w:ascii="Angsana New" w:hAnsi="Angsana New" w:cs="Angsana New"/>
+          <w:b/>
+          <w:bCs/>
+          <w:color w:val="0070C0"/>
+          <w:sz w:val="32"/>
+          <w:szCs w:val="32"/>
+          <w:cs/>
+          <w:lang w:val="en-US"/>
+        </w:rPr>
+        <w:t xml:space="preserve">จากการที่ทำ </w:t>
+      </w:r>
+      <w:r>
+        <w:rPr>
+          <w:rFonts w:ascii="Angsana New" w:hAnsi="Angsana New" w:cs="Angsana New"/>
+          <w:b/>
+          <w:bCs/>
+          <w:color w:val="0070C0"/>
+          <w:sz w:val="32"/>
+          <w:szCs w:val="32"/>
+          <w:lang w:val="en-US"/>
+        </w:rPr>
+        <w:t>spoof</w:t>
+      </w:r>
     </w:p>
     <w:p>
       <w:pPr>
@@ -46,46 +117,240 @@
     <w:p>
       <w:pPr>
         <w:pStyle w:val="NormalWeb"/>
+        <w:numPr>
+          <w:ilvl w:val="0"/>
+          <w:numId w:val="2"/>
+        </w:numPr>
+        <w:shd w:val="clear" w:color="auto" w:fill="FFFFFF"/>
+        <w:rPr>
+          <w:rFonts w:ascii="Angsana New" w:hAnsi="Angsana New" w:cs="Angsana New"/>
+          <w:b/>
+          <w:bCs/>
+          <w:i/>
+          <w:iCs/>
+          <w:color w:val="0070C0"/>
+          <w:sz w:val="32"/>
+          <w:szCs w:val="32"/>
+          <w:lang w:val="en-US"/>
+        </w:rPr>
+      </w:pPr>
+      <w:r>
+        <w:rPr>
+          <w:rFonts w:ascii="Angsana New" w:hAnsi="Angsana New" w:cs="Angsana New"/>
+          <w:b/>
+          <w:bCs/>
+          <w:i/>
+          <w:iCs/>
+          <w:color w:val="0070C0"/>
+          <w:sz w:val="32"/>
+          <w:szCs w:val="32"/>
+          <w:lang w:val="en-US"/>
+        </w:rPr>
+        <w:t>n</w:t>
+      </w:r>
+      <w:r>
+        <w:rPr>
+          <w:rFonts w:ascii="Angsana New" w:hAnsi="Angsana New" w:cs="Angsana New"/>
+          <w:b/>
+          <w:bCs/>
+          <w:i/>
+          <w:iCs/>
+          <w:color w:val="0070C0"/>
+          <w:sz w:val="32"/>
+          <w:szCs w:val="32"/>
+        </w:rPr>
+        <w:t xml:space="preserve">etwox 76 -i </w:t>
+      </w:r>
+      <w:r>
+        <w:rPr>
+          <w:rFonts w:ascii="Angsana New" w:hAnsi="Angsana New" w:cs="Angsana New"/>
+          <w:b/>
+          <w:bCs/>
+          <w:i/>
+          <w:iCs/>
+          <w:color w:val="0070C0"/>
+          <w:sz w:val="32"/>
+          <w:szCs w:val="32"/>
+          <w:lang w:val="en-US"/>
+        </w:rPr>
+        <w:t>“</w:t>
+      </w:r>
+      <w:r>
+        <w:rPr>
+          <w:rFonts w:ascii="Angsana New" w:hAnsi="Angsana New" w:cs="Angsana New"/>
+          <w:b/>
+          <w:bCs/>
+          <w:i/>
+          <w:iCs/>
+          <w:color w:val="0070C0"/>
+          <w:sz w:val="32"/>
+          <w:szCs w:val="32"/>
+        </w:rPr>
+        <w:t>127.0.0.1</w:t>
+      </w:r>
+      <w:r>
+        <w:rPr>
+          <w:rFonts w:ascii="Angsana New" w:hAnsi="Angsana New" w:cs="Angsana New"/>
+          <w:b/>
+          <w:bCs/>
+          <w:i/>
+          <w:iCs/>
+          <w:color w:val="0070C0"/>
+          <w:sz w:val="32"/>
+          <w:szCs w:val="32"/>
+          <w:lang w:val="en-US"/>
+        </w:rPr>
+        <w:t>”</w:t>
+      </w:r>
+      <w:r>
+        <w:rPr>
+          <w:rFonts w:ascii="Angsana New" w:hAnsi="Angsana New" w:cs="Angsana New"/>
+          <w:b/>
+          <w:bCs/>
+          <w:i/>
+          <w:iCs/>
+          <w:color w:val="0070C0"/>
+          <w:sz w:val="32"/>
+          <w:szCs w:val="32"/>
+        </w:rPr>
+        <w:t xml:space="preserve"> -p </w:t>
+      </w:r>
+      <w:r>
+        <w:rPr>
+          <w:rFonts w:ascii="Angsana New" w:hAnsi="Angsana New" w:cs="Angsana New"/>
+          <w:b/>
+          <w:bCs/>
+          <w:i/>
+          <w:iCs/>
+          <w:color w:val="0070C0"/>
+          <w:sz w:val="32"/>
+          <w:szCs w:val="32"/>
+          <w:lang w:val="en-US"/>
+        </w:rPr>
+        <w:t>“</w:t>
+      </w:r>
+      <w:r>
+        <w:rPr>
+          <w:rFonts w:ascii="Angsana New" w:hAnsi="Angsana New" w:cs="Angsana New"/>
+          <w:b/>
+          <w:bCs/>
+          <w:i/>
+          <w:iCs/>
+          <w:color w:val="0070C0"/>
+          <w:sz w:val="32"/>
+          <w:szCs w:val="32"/>
+        </w:rPr>
+        <w:t>80</w:t>
+      </w:r>
+      <w:r>
+        <w:rPr>
+          <w:rFonts w:ascii="Angsana New" w:hAnsi="Angsana New" w:cs="Angsana New"/>
+          <w:b/>
+          <w:bCs/>
+          <w:i/>
+          <w:iCs/>
+          <w:color w:val="0070C0"/>
+          <w:sz w:val="32"/>
+          <w:szCs w:val="32"/>
+          <w:lang w:val="en-US"/>
+        </w:rPr>
+        <w:t>”</w:t>
+      </w:r>
+    </w:p>
+    <w:p>
+      <w:pPr>
+        <w:pStyle w:val="NormalWeb"/>
+        <w:shd w:val="clear" w:color="auto" w:fill="FFFFFF"/>
+        <w:rPr>
+          <w:lang w:val="en-US"/>
+        </w:rPr>
+      </w:pPr>
+    </w:p>
+    <w:p>
+      <w:pPr>
+        <w:pStyle w:val="NormalWeb"/>
         <w:shd w:val="clear" w:color="auto" w:fill="FFFFFF"/>
         <w:rPr>
           <w:rFonts w:ascii="PalatinoLTPro" w:hAnsi="PalatinoLTPro"/>
         </w:rPr>
       </w:pPr>
-    </w:p>
-    <w:p>
-      <w:pPr>
-        <w:pStyle w:val="NormalWeb"/>
-        <w:shd w:val="clear" w:color="auto" w:fill="FFFFFF"/>
-        <w:rPr>
-          <w:lang w:val="en-US"/>
-        </w:rPr>
-      </w:pPr>
-    </w:p>
-    <w:p>
-      <w:pPr>
-        <w:pStyle w:val="NormalWeb"/>
-        <w:shd w:val="clear" w:color="auto" w:fill="FFFFFF"/>
+      <w:r>
         <w:rPr>
           <w:rFonts w:ascii="PalatinoLTPro" w:hAnsi="PalatinoLTPro"/>
         </w:rPr>
-      </w:pPr>
-      <w:r>
-        <w:rPr>
-          <w:rFonts w:ascii="PalatinoLTPro" w:hAnsi="PalatinoLTPro"/>
-        </w:rPr>
         <w:t xml:space="preserve">Q3. How do you know the attack is successful? Hint: Use the browser on your notebook to access the webpage. What should happen if the attack is successful? </w:t>
       </w:r>
     </w:p>
     <w:p>
       <w:pPr>
         <w:pStyle w:val="NormalWeb"/>
-        <w:shd w:val="clear" w:color="auto" w:fill="FFFFFF"/>
-      </w:pPr>
-      <w:r>
+        <w:numPr>
+          <w:ilvl w:val="0"/>
+          <w:numId w:val="2"/>
+        </w:numPr>
+        <w:shd w:val="clear" w:color="auto" w:fill="FFFFFF"/>
+        <w:rPr>
+          <w:rFonts w:asciiTheme="majorBidi" w:hAnsiTheme="majorBidi" w:cstheme="majorBidi"/>
+          <w:b/>
+          <w:bCs/>
+          <w:color w:val="0070C0"/>
+          <w:sz w:val="32"/>
+          <w:szCs w:val="32"/>
+          <w:cs/>
+          <w:lang w:val="en-US"/>
+        </w:rPr>
+      </w:pPr>
+      <w:r>
+        <w:rPr>
+          <w:rFonts w:asciiTheme="majorBidi" w:hAnsiTheme="majorBidi" w:cstheme="majorBidi"/>
+          <w:b/>
+          <w:bCs/>
+          <w:color w:val="0070C0"/>
+          <w:sz w:val="32"/>
+          <w:szCs w:val="32"/>
+          <w:cs/>
+        </w:rPr>
+        <w:t xml:space="preserve">ไม่สามารถเข้าถึง </w:t>
+      </w:r>
+      <w:r>
+        <w:rPr>
+          <w:rFonts w:asciiTheme="majorBidi" w:hAnsiTheme="majorBidi" w:cstheme="majorBidi"/>
+          <w:b/>
+          <w:bCs/>
+          <w:color w:val="0070C0"/>
+          <w:sz w:val="32"/>
+          <w:szCs w:val="32"/>
+          <w:lang w:val="en-US"/>
+        </w:rPr>
+        <w:t xml:space="preserve">website </w:t>
+      </w:r>
+      <w:r>
+        <w:rPr>
+          <w:rFonts w:asciiTheme="majorBidi" w:hAnsiTheme="majorBidi" w:cstheme="majorBidi"/>
+          <w:b/>
+          <w:bCs/>
+          <w:color w:val="0070C0"/>
+          <w:sz w:val="32"/>
+          <w:szCs w:val="32"/>
+          <w:cs/>
+          <w:lang w:val="en-US"/>
+        </w:rPr>
+        <w:t>ได้ดังรูป</w:t>
+      </w:r>
+    </w:p>
+    <w:p>
+      <w:pPr>
+        <w:pStyle w:val="NormalWeb"/>
+        <w:shd w:val="clear" w:color="auto" w:fill="FFFFFF"/>
+      </w:pPr>
+      <w:r>
+        <w:rPr>
+          <w:noProof/>
+        </w:rPr>
         <w:drawing>
-          <wp:inline distT="0" distB="0" distL="0" distR="0" wp14:anchorId="6036ACC5" wp14:editId="748F533B">
-            <wp:extent cx="5943600" cy="2030730"/>
-            <wp:effectExtent l="0" t="0" r="0" b="1270"/>
+          <wp:inline distT="0" distB="0" distL="0" distR="0" wp14:anchorId="6036ACC5" wp14:editId="4D8163BD">
+            <wp:extent cx="6059277" cy="2070253"/>
+            <wp:effectExtent l="0" t="0" r="0" b="0"/>
             <wp:docPr id="12" name="Picture 12" descr="Graphical user interface, text, application, Teams&#10;&#10;Description automatically generated"/>
             <wp:cNvGraphicFramePr>
               <a:graphicFrameLocks xmlns:a="http://schemas.openxmlformats.org/drawingml/2006/main" noChangeAspect="1"/>
@@ -106,7 +371,7 @@
                   <pic:spPr>
                     <a:xfrm>
                       <a:off x="0" y="0"/>
-                      <a:ext cx="5943600" cy="2030730"/>
+                      <a:ext cx="6059725" cy="2070406"/>
                     </a:xfrm>
                     <a:prstGeom prst="rect">
                       <a:avLst/>
@@ -167,6 +432,15 @@
         <w:shd w:val="clear" w:color="auto" w:fill="FFFFFF"/>
       </w:pPr>
       <w:r>
+        <w:rPr>
+          <w:rFonts w:ascii="PalatinoLTPro" w:hAnsi="PalatinoLTPro"/>
+        </w:rPr>
+        <w:tab/>
+      </w:r>
+      <w:r>
+        <w:rPr>
+          <w:noProof/>
+        </w:rPr>
         <w:drawing>
           <wp:inline distT="0" distB="0" distL="0" distR="0" wp14:anchorId="5A041982" wp14:editId="6A537381">
             <wp:extent cx="5080000" cy="3797300"/>
@@ -246,17 +520,318 @@
     <w:p>
       <w:pPr>
         <w:pStyle w:val="NormalWeb"/>
-        <w:shd w:val="clear" w:color="auto" w:fill="FFFFFF"/>
-      </w:pPr>
-    </w:p>
-    <w:p>
-      <w:pPr>
-        <w:pStyle w:val="NormalWeb"/>
-        <w:shd w:val="clear" w:color="auto" w:fill="FFFFFF"/>
-      </w:pPr>
-      <w:r>
+        <w:numPr>
+          <w:ilvl w:val="0"/>
+          <w:numId w:val="2"/>
+        </w:numPr>
+        <w:shd w:val="clear" w:color="auto" w:fill="FFFFFF"/>
+        <w:rPr>
+          <w:rFonts w:asciiTheme="majorBidi" w:hAnsiTheme="majorBidi" w:cstheme="majorBidi" w:hint="cs"/>
+          <w:b/>
+          <w:bCs/>
+          <w:color w:val="0070C0"/>
+          <w:sz w:val="32"/>
+          <w:szCs w:val="32"/>
+          <w:lang w:val="en-US"/>
+        </w:rPr>
+      </w:pPr>
+      <w:r>
+        <w:rPr>
+          <w:rFonts w:asciiTheme="majorBidi" w:hAnsiTheme="majorBidi" w:cstheme="majorBidi"/>
+          <w:b/>
+          <w:bCs/>
+          <w:color w:val="0070C0"/>
+          <w:sz w:val="32"/>
+          <w:szCs w:val="32"/>
+          <w:cs/>
+        </w:rPr>
+        <w:t>ในตอนเริ่มต้นมี</w:t>
+      </w:r>
+      <w:r>
+        <w:rPr>
+          <w:rFonts w:asciiTheme="majorBidi" w:hAnsiTheme="majorBidi" w:cstheme="majorBidi" w:hint="cs"/>
+          <w:b/>
+          <w:bCs/>
+          <w:color w:val="0070C0"/>
+          <w:sz w:val="32"/>
+          <w:szCs w:val="32"/>
+          <w:cs/>
+        </w:rPr>
+        <w:t>ว่าง</w:t>
+      </w:r>
+      <w:r>
+        <w:rPr>
+          <w:rFonts w:asciiTheme="majorBidi" w:hAnsiTheme="majorBidi" w:cstheme="majorBidi"/>
+          <w:b/>
+          <w:bCs/>
+          <w:color w:val="0070C0"/>
+          <w:sz w:val="32"/>
+          <w:szCs w:val="32"/>
+          <w:cs/>
+        </w:rPr>
+        <w:t xml:space="preserve">อยู่ </w:t>
+      </w:r>
+      <w:r>
+        <w:rPr>
+          <w:rFonts w:asciiTheme="majorBidi" w:hAnsiTheme="majorBidi" w:cstheme="majorBidi"/>
+          <w:b/>
+          <w:bCs/>
+          <w:color w:val="0070C0"/>
+          <w:sz w:val="32"/>
+          <w:szCs w:val="32"/>
+          <w:lang w:val="en-US"/>
+        </w:rPr>
+        <w:t>512</w:t>
+      </w:r>
+      <w:r>
+        <w:rPr>
+          <w:rFonts w:asciiTheme="majorBidi" w:hAnsiTheme="majorBidi" w:cstheme="majorBidi" w:hint="cs"/>
+          <w:b/>
+          <w:bCs/>
+          <w:color w:val="0070C0"/>
+          <w:sz w:val="32"/>
+          <w:szCs w:val="32"/>
+          <w:cs/>
+          <w:lang w:val="en-US"/>
+        </w:rPr>
+        <w:t xml:space="preserve"> และใช้ไป </w:t>
+      </w:r>
+      <w:r>
+        <w:rPr>
+          <w:rFonts w:asciiTheme="majorBidi" w:hAnsiTheme="majorBidi" w:cstheme="majorBidi"/>
+          <w:b/>
+          <w:bCs/>
+          <w:color w:val="0070C0"/>
+          <w:sz w:val="32"/>
+          <w:szCs w:val="32"/>
+          <w:lang w:val="en-US"/>
+        </w:rPr>
+        <w:t>1</w:t>
+      </w:r>
+      <w:r>
+        <w:rPr>
+          <w:rFonts w:asciiTheme="majorBidi" w:hAnsiTheme="majorBidi" w:cstheme="majorBidi" w:hint="cs"/>
+          <w:b/>
+          <w:bCs/>
+          <w:color w:val="0070C0"/>
+          <w:sz w:val="32"/>
+          <w:szCs w:val="32"/>
+          <w:cs/>
+          <w:lang w:val="en-US"/>
+        </w:rPr>
+        <w:t xml:space="preserve"> เพราะทดสอบเข้า </w:t>
+      </w:r>
+      <w:r>
+        <w:rPr>
+          <w:rFonts w:asciiTheme="majorBidi" w:hAnsiTheme="majorBidi" w:cstheme="majorBidi"/>
+          <w:b/>
+          <w:bCs/>
+          <w:color w:val="0070C0"/>
+          <w:sz w:val="32"/>
+          <w:szCs w:val="32"/>
+          <w:lang w:val="en-US"/>
+        </w:rPr>
+        <w:t xml:space="preserve">website </w:t>
+      </w:r>
+      <w:r>
+        <w:rPr>
+          <w:rFonts w:asciiTheme="majorBidi" w:hAnsiTheme="majorBidi" w:cstheme="majorBidi" w:hint="cs"/>
+          <w:b/>
+          <w:bCs/>
+          <w:color w:val="0070C0"/>
+          <w:sz w:val="32"/>
+          <w:szCs w:val="32"/>
+          <w:cs/>
+          <w:lang w:val="en-US"/>
+        </w:rPr>
+        <w:t xml:space="preserve">ด้วย </w:t>
+      </w:r>
+      <w:r>
+        <w:rPr>
+          <w:rFonts w:asciiTheme="majorBidi" w:hAnsiTheme="majorBidi" w:cstheme="majorBidi"/>
+          <w:b/>
+          <w:bCs/>
+          <w:color w:val="0070C0"/>
+          <w:sz w:val="32"/>
+          <w:szCs w:val="32"/>
+          <w:lang w:val="en-US"/>
+        </w:rPr>
+        <w:t xml:space="preserve">IP Address </w:t>
+      </w:r>
+      <w:r>
+        <w:rPr>
+          <w:rFonts w:asciiTheme="majorBidi" w:hAnsiTheme="majorBidi" w:cstheme="majorBidi" w:hint="cs"/>
+          <w:b/>
+          <w:bCs/>
+          <w:color w:val="0070C0"/>
+          <w:sz w:val="32"/>
+          <w:szCs w:val="32"/>
+          <w:cs/>
+          <w:lang w:val="en-US"/>
+        </w:rPr>
+        <w:t xml:space="preserve">ของเครื่อง </w:t>
+      </w:r>
+      <w:r>
+        <w:rPr>
+          <w:rFonts w:asciiTheme="majorBidi" w:hAnsiTheme="majorBidi" w:cstheme="majorBidi"/>
+          <w:b/>
+          <w:bCs/>
+          <w:color w:val="0070C0"/>
+          <w:sz w:val="32"/>
+          <w:szCs w:val="32"/>
+          <w:lang w:val="en-US"/>
+        </w:rPr>
+        <w:t xml:space="preserve">VM </w:t>
+      </w:r>
+      <w:r>
+        <w:rPr>
+          <w:rFonts w:asciiTheme="majorBidi" w:hAnsiTheme="majorBidi" w:cstheme="majorBidi" w:hint="cs"/>
+          <w:b/>
+          <w:bCs/>
+          <w:color w:val="0070C0"/>
+          <w:sz w:val="32"/>
+          <w:szCs w:val="32"/>
+          <w:cs/>
+          <w:lang w:val="en-US"/>
+        </w:rPr>
+        <w:t xml:space="preserve">จากเครื่อง </w:t>
+      </w:r>
+      <w:r>
+        <w:rPr>
+          <w:rFonts w:asciiTheme="majorBidi" w:hAnsiTheme="majorBidi" w:cstheme="majorBidi"/>
+          <w:b/>
+          <w:bCs/>
+          <w:color w:val="0070C0"/>
+          <w:sz w:val="32"/>
+          <w:szCs w:val="32"/>
+          <w:lang w:val="en-US"/>
+        </w:rPr>
+        <w:t>notebook</w:t>
+      </w:r>
+      <w:r>
+        <w:rPr>
+          <w:rFonts w:asciiTheme="majorBidi" w:hAnsiTheme="majorBidi" w:cstheme="majorBidi"/>
+          <w:b/>
+          <w:bCs/>
+          <w:color w:val="0070C0"/>
+          <w:sz w:val="32"/>
+          <w:szCs w:val="32"/>
+          <w:lang w:val="en-US"/>
+        </w:rPr>
+        <w:t xml:space="preserve"> </w:t>
+      </w:r>
+      <w:r>
+        <w:rPr>
+          <w:rFonts w:asciiTheme="majorBidi" w:hAnsiTheme="majorBidi" w:cstheme="majorBidi" w:hint="cs"/>
+          <w:b/>
+          <w:bCs/>
+          <w:color w:val="0070C0"/>
+          <w:sz w:val="32"/>
+          <w:szCs w:val="32"/>
+          <w:cs/>
+          <w:lang w:val="en-US"/>
+        </w:rPr>
+        <w:t xml:space="preserve">และถูกจองใช้ไป </w:t>
+      </w:r>
+      <w:r>
+        <w:rPr>
+          <w:rFonts w:asciiTheme="majorBidi" w:hAnsiTheme="majorBidi" w:cstheme="majorBidi"/>
+          <w:b/>
+          <w:bCs/>
+          <w:color w:val="0070C0"/>
+          <w:sz w:val="32"/>
+          <w:szCs w:val="32"/>
+          <w:lang w:val="en-US"/>
+        </w:rPr>
+        <w:t xml:space="preserve">257 </w:t>
+      </w:r>
+      <w:r>
+        <w:rPr>
+          <w:rFonts w:asciiTheme="majorBidi" w:hAnsiTheme="majorBidi" w:cstheme="majorBidi" w:hint="cs"/>
+          <w:b/>
+          <w:bCs/>
+          <w:color w:val="0070C0"/>
+          <w:sz w:val="32"/>
+          <w:szCs w:val="32"/>
+          <w:cs/>
+          <w:lang w:val="en-US"/>
+        </w:rPr>
+        <w:t xml:space="preserve">หลังจากการโจมตี </w:t>
+      </w:r>
+      <w:r>
+        <w:rPr>
+          <w:rFonts w:asciiTheme="majorBidi" w:hAnsiTheme="majorBidi" w:cstheme="majorBidi"/>
+          <w:b/>
+          <w:bCs/>
+          <w:color w:val="0070C0"/>
+          <w:sz w:val="32"/>
+          <w:szCs w:val="32"/>
+          <w:lang w:val="en-US"/>
+        </w:rPr>
+        <w:t>(</w:t>
+      </w:r>
+      <w:r>
+        <w:rPr>
+          <w:rFonts w:asciiTheme="majorBidi" w:hAnsiTheme="majorBidi" w:cstheme="majorBidi" w:hint="cs"/>
+          <w:b/>
+          <w:bCs/>
+          <w:color w:val="0070C0"/>
+          <w:sz w:val="32"/>
+          <w:szCs w:val="32"/>
+          <w:cs/>
+          <w:lang w:val="en-US"/>
+        </w:rPr>
+        <w:t>เปิด</w:t>
+      </w:r>
+      <w:r>
+        <w:rPr>
+          <w:rFonts w:asciiTheme="majorBidi" w:hAnsiTheme="majorBidi" w:cstheme="majorBidi"/>
+          <w:b/>
+          <w:bCs/>
+          <w:color w:val="0070C0"/>
+          <w:sz w:val="32"/>
+          <w:szCs w:val="32"/>
+          <w:lang w:val="en-US"/>
+        </w:rPr>
+        <w:t xml:space="preserve"> port </w:t>
+      </w:r>
+      <w:r>
+        <w:rPr>
+          <w:rFonts w:asciiTheme="majorBidi" w:hAnsiTheme="majorBidi" w:cstheme="majorBidi" w:hint="cs"/>
+          <w:b/>
+          <w:bCs/>
+          <w:color w:val="0070C0"/>
+          <w:sz w:val="32"/>
+          <w:szCs w:val="32"/>
+          <w:cs/>
+          <w:lang w:val="en-US"/>
+        </w:rPr>
+        <w:t>รอฝ่ายเดียว</w:t>
+      </w:r>
+      <w:r>
+        <w:rPr>
+          <w:rFonts w:asciiTheme="majorBidi" w:hAnsiTheme="majorBidi" w:cstheme="majorBidi"/>
+          <w:b/>
+          <w:bCs/>
+          <w:color w:val="0070C0"/>
+          <w:sz w:val="32"/>
+          <w:szCs w:val="32"/>
+          <w:lang w:val="en-US"/>
+        </w:rPr>
+        <w:t>)</w:t>
+      </w:r>
+      <w:r>
+        <w:rPr>
+          <w:noProof/>
+        </w:rPr>
+        <w:t xml:space="preserve"> </w:t>
+      </w:r>
+      <w:r>
+        <w:rPr>
+          <w:noProof/>
+        </w:rPr>
         <w:drawing>
-          <wp:inline distT="0" distB="0" distL="0" distR="0" wp14:anchorId="488718C0" wp14:editId="01CD4FF3">
+          <wp:inline distT="0" distB="0" distL="0" distR="0" wp14:anchorId="12B08F96" wp14:editId="1A811B47">
             <wp:extent cx="4508500" cy="838200"/>
             <wp:effectExtent l="0" t="0" r="0" b="0"/>
             <wp:docPr id="11" name="Picture 11" descr="Graphical user interface, text&#10;&#10;Description automatically generated"/>
@@ -291,15 +866,12 @@
           </wp:inline>
         </w:drawing>
       </w:r>
-    </w:p>
-    <w:p>
-      <w:pPr>
-        <w:pStyle w:val="NormalWeb"/>
-        <w:shd w:val="clear" w:color="auto" w:fill="FFFFFF"/>
-      </w:pPr>
-      <w:r>
+      <w:r>
+        <w:rPr>
+          <w:noProof/>
+        </w:rPr>
         <w:drawing>
-          <wp:inline distT="0" distB="0" distL="0" distR="0" wp14:anchorId="150F61E2" wp14:editId="0A2ACFB4">
+          <wp:inline distT="0" distB="0" distL="0" distR="0" wp14:anchorId="3E09378C" wp14:editId="02A4C98F">
             <wp:extent cx="4292600" cy="266700"/>
             <wp:effectExtent l="0" t="0" r="0" b="0"/>
             <wp:docPr id="9" name="Picture 9"/>
@@ -354,46 +926,281 @@
         <w:t xml:space="preserve">Q6. How do TCP SYN cookies prevent this type of attack? </w:t>
       </w:r>
     </w:p>
+    <w:p>
+      <w:pPr>
+        <w:pStyle w:val="ListParagraph"/>
+        <w:numPr>
+          <w:ilvl w:val="0"/>
+          <w:numId w:val="2"/>
+        </w:numPr>
+        <w:rPr>
+          <w:rFonts w:asciiTheme="majorBidi" w:hAnsiTheme="majorBidi" w:cstheme="majorBidi"/>
+          <w:b/>
+          <w:bCs/>
+          <w:color w:val="0070C0"/>
+          <w:sz w:val="32"/>
+          <w:szCs w:val="32"/>
+          <w:lang w:val="en-US"/>
+        </w:rPr>
+      </w:pPr>
+      <w:r>
+        <w:rPr>
+          <w:rFonts w:asciiTheme="majorBidi" w:hAnsiTheme="majorBidi" w:cstheme="majorBidi"/>
+          <w:b/>
+          <w:bCs/>
+          <w:color w:val="0070C0"/>
+          <w:sz w:val="32"/>
+          <w:szCs w:val="32"/>
+          <w:cs/>
+          <w:lang w:val="en-US"/>
+        </w:rPr>
+        <w:t xml:space="preserve">เป็นการใช้ </w:t>
+      </w:r>
+      <w:r>
+        <w:rPr>
+          <w:rFonts w:asciiTheme="majorBidi" w:hAnsiTheme="majorBidi" w:cstheme="majorBidi"/>
+          <w:b/>
+          <w:bCs/>
+          <w:color w:val="0070C0"/>
+          <w:sz w:val="32"/>
+          <w:szCs w:val="32"/>
+          <w:lang w:val="en-US"/>
+        </w:rPr>
+        <w:t xml:space="preserve">sequence number </w:t>
+      </w:r>
+      <w:r>
+        <w:rPr>
+          <w:rFonts w:asciiTheme="majorBidi" w:hAnsiTheme="majorBidi" w:cstheme="majorBidi"/>
+          <w:b/>
+          <w:bCs/>
+          <w:color w:val="0070C0"/>
+          <w:sz w:val="32"/>
+          <w:szCs w:val="32"/>
+          <w:cs/>
+          <w:lang w:val="en-US"/>
+        </w:rPr>
+        <w:t xml:space="preserve">ในการเก็บข้อมูลของ </w:t>
+      </w:r>
+      <w:r>
+        <w:rPr>
+          <w:rFonts w:asciiTheme="majorBidi" w:hAnsiTheme="majorBidi" w:cstheme="majorBidi"/>
+          <w:b/>
+          <w:bCs/>
+          <w:color w:val="0070C0"/>
+          <w:sz w:val="32"/>
+          <w:szCs w:val="32"/>
+          <w:lang w:val="en-US"/>
+        </w:rPr>
+        <w:t>SYN queue entry</w:t>
+      </w:r>
+      <w:r>
+        <w:rPr>
+          <w:rFonts w:asciiTheme="majorBidi" w:hAnsiTheme="majorBidi" w:cstheme="majorBidi"/>
+          <w:b/>
+          <w:bCs/>
+          <w:color w:val="0070C0"/>
+          <w:sz w:val="32"/>
+          <w:szCs w:val="32"/>
+          <w:cs/>
+          <w:lang w:val="en-US"/>
+        </w:rPr>
+        <w:t xml:space="preserve"> แทนการใส่ </w:t>
+      </w:r>
+      <w:r>
+        <w:rPr>
+          <w:rFonts w:asciiTheme="majorBidi" w:hAnsiTheme="majorBidi" w:cstheme="majorBidi"/>
+          <w:b/>
+          <w:bCs/>
+          <w:color w:val="0070C0"/>
+          <w:sz w:val="32"/>
+          <w:szCs w:val="32"/>
+          <w:lang w:val="en-US"/>
+        </w:rPr>
+        <w:t xml:space="preserve">queue </w:t>
+      </w:r>
+      <w:r>
+        <w:rPr>
+          <w:rFonts w:asciiTheme="majorBidi" w:hAnsiTheme="majorBidi" w:cstheme="majorBidi"/>
+          <w:b/>
+          <w:bCs/>
+          <w:color w:val="0070C0"/>
+          <w:sz w:val="32"/>
+          <w:szCs w:val="32"/>
+          <w:cs/>
+          <w:lang w:val="en-US"/>
+        </w:rPr>
+        <w:t xml:space="preserve">ตรง ๆ หากยังไม่ได้รับ </w:t>
+      </w:r>
+      <w:r>
+        <w:rPr>
+          <w:rFonts w:asciiTheme="majorBidi" w:hAnsiTheme="majorBidi" w:cstheme="majorBidi"/>
+          <w:b/>
+          <w:bCs/>
+          <w:color w:val="0070C0"/>
+          <w:sz w:val="32"/>
+          <w:szCs w:val="32"/>
+          <w:lang w:val="en-US"/>
+        </w:rPr>
+        <w:t xml:space="preserve">response </w:t>
+      </w:r>
+      <w:r>
+        <w:rPr>
+          <w:rFonts w:asciiTheme="majorBidi" w:hAnsiTheme="majorBidi" w:cstheme="majorBidi"/>
+          <w:b/>
+          <w:bCs/>
+          <w:color w:val="0070C0"/>
+          <w:sz w:val="32"/>
+          <w:szCs w:val="32"/>
+          <w:cs/>
+          <w:lang w:val="en-US"/>
+        </w:rPr>
+        <w:t xml:space="preserve">ทำให้ </w:t>
+      </w:r>
+      <w:r>
+        <w:rPr>
+          <w:rFonts w:asciiTheme="majorBidi" w:hAnsiTheme="majorBidi" w:cstheme="majorBidi"/>
+          <w:b/>
+          <w:bCs/>
+          <w:color w:val="0070C0"/>
+          <w:sz w:val="32"/>
+          <w:szCs w:val="32"/>
+          <w:lang w:val="en-US"/>
+        </w:rPr>
+        <w:t xml:space="preserve">queue </w:t>
+      </w:r>
+      <w:r>
+        <w:rPr>
+          <w:rFonts w:asciiTheme="majorBidi" w:hAnsiTheme="majorBidi" w:cstheme="majorBidi"/>
+          <w:b/>
+          <w:bCs/>
+          <w:color w:val="0070C0"/>
+          <w:sz w:val="32"/>
+          <w:szCs w:val="32"/>
+          <w:cs/>
+          <w:lang w:val="en-US"/>
+        </w:rPr>
+        <w:t>ไม่เต็ม</w:t>
+      </w:r>
+    </w:p>
+    <w:p>
+      <w:pPr>
+        <w:rPr>
+          <w:b/>
+          <w:bCs/>
+          <w:cs/>
+        </w:rPr>
+      </w:pPr>
+    </w:p>
     <w:p/>
-    <w:p/>
-    <w:p>
-      <w:r>
-        <w:br w:type="page"/>
-      </w:r>
-    </w:p>
-    <w:p>
-      <w:pPr>
-        <w:pStyle w:val="NormalWeb"/>
-        <w:shd w:val="clear" w:color="auto" w:fill="FFFFFF"/>
+    <w:p>
+      <w:r>
         <w:rPr>
           <w:rFonts w:ascii="PalatinoLTPro" w:hAnsi="PalatinoLTPro"/>
         </w:rPr>
-      </w:pPr>
+        <w:t>Q7. For each piece of secret that you steal from the Heartbleed attack, you need to show the screenshots as the proof. Upload a pdf of your screenshots.</w:t>
+      </w:r>
       <w:r>
         <w:rPr>
           <w:rFonts w:ascii="PalatinoLTPro" w:hAnsi="PalatinoLTPro"/>
         </w:rPr>
-        <w:lastRenderedPageBreak/>
-        <w:t>Q7. For each piece of secret that you steal from the Heartbleed attack, you need to show the screenshots as the proof. Upload a pdf of your screenshots.</w:t>
-      </w:r>
-      <w:r>
+        <w:br/>
+      </w:r>
+    </w:p>
+    <w:p>
+      <w:pPr>
+        <w:pStyle w:val="NormalWeb"/>
+        <w:numPr>
+          <w:ilvl w:val="0"/>
+          <w:numId w:val="2"/>
+        </w:numPr>
+        <w:shd w:val="clear" w:color="auto" w:fill="FFFFFF"/>
+        <w:rPr>
+          <w:rFonts w:asciiTheme="majorBidi" w:hAnsiTheme="majorBidi" w:cstheme="majorBidi"/>
+          <w:b/>
+          <w:bCs/>
+          <w:color w:val="0070C0"/>
+          <w:sz w:val="32"/>
+          <w:szCs w:val="32"/>
+          <w:cs/>
+          <w:lang w:val="en-US"/>
+        </w:rPr>
+      </w:pPr>
+      <w:r>
+        <w:rPr>
+          <w:rFonts w:asciiTheme="majorBidi" w:hAnsiTheme="majorBidi" w:cstheme="majorBidi"/>
+          <w:b/>
+          <w:bCs/>
+          <w:color w:val="0070C0"/>
+          <w:sz w:val="32"/>
+          <w:szCs w:val="32"/>
+          <w:cs/>
+        </w:rPr>
+        <w:t xml:space="preserve">จากรูปจะเห็นว่าใน </w:t>
+      </w:r>
+      <w:r>
+        <w:rPr>
+          <w:rFonts w:asciiTheme="majorBidi" w:hAnsiTheme="majorBidi" w:cstheme="majorBidi"/>
+          <w:b/>
+          <w:bCs/>
+          <w:color w:val="0070C0"/>
+          <w:sz w:val="32"/>
+          <w:szCs w:val="32"/>
+          <w:lang w:val="en-US"/>
+        </w:rPr>
+        <w:t xml:space="preserve">2 </w:t>
+      </w:r>
+      <w:r>
+        <w:rPr>
+          <w:rFonts w:asciiTheme="majorBidi" w:hAnsiTheme="majorBidi" w:cstheme="majorBidi"/>
+          <w:b/>
+          <w:bCs/>
+          <w:color w:val="0070C0"/>
+          <w:sz w:val="32"/>
+          <w:szCs w:val="32"/>
+          <w:cs/>
+          <w:lang w:val="en-US"/>
+        </w:rPr>
+        <w:t xml:space="preserve">บรรทัดด้านล่างจะมีข้อมูล ข้อความที่เราส่งหา </w:t>
+      </w:r>
+      <w:proofErr w:type="spellStart"/>
+      <w:r>
+        <w:rPr>
+          <w:rFonts w:asciiTheme="majorBidi" w:hAnsiTheme="majorBidi" w:cstheme="majorBidi"/>
+          <w:b/>
+          <w:bCs/>
+          <w:color w:val="0070C0"/>
+          <w:sz w:val="32"/>
+          <w:szCs w:val="32"/>
+          <w:lang w:val="en-US"/>
+        </w:rPr>
+        <w:t>Boby</w:t>
+      </w:r>
+      <w:proofErr w:type="spellEnd"/>
+      <w:r>
+        <w:rPr>
+          <w:rFonts w:asciiTheme="majorBidi" w:hAnsiTheme="majorBidi" w:cstheme="majorBidi"/>
+          <w:b/>
+          <w:bCs/>
+          <w:color w:val="0070C0"/>
+          <w:sz w:val="32"/>
+          <w:szCs w:val="32"/>
+          <w:lang w:val="en-US"/>
+        </w:rPr>
+        <w:t xml:space="preserve"> </w:t>
+      </w:r>
+    </w:p>
+    <w:p>
+      <w:pPr>
+        <w:pStyle w:val="NormalWeb"/>
+        <w:shd w:val="clear" w:color="auto" w:fill="FFFFFF"/>
         <w:rPr>
           <w:rFonts w:ascii="PalatinoLTPro" w:hAnsi="PalatinoLTPro"/>
         </w:rPr>
-        <w:br/>
-      </w:r>
-    </w:p>
-    <w:p>
-      <w:pPr>
-        <w:pStyle w:val="NormalWeb"/>
-        <w:shd w:val="clear" w:color="auto" w:fill="FFFFFF"/>
+      </w:pPr>
+      <w:r>
         <w:rPr>
           <w:rFonts w:ascii="PalatinoLTPro" w:hAnsi="PalatinoLTPro"/>
-        </w:rPr>
-      </w:pPr>
-      <w:r>
-        <w:rPr>
-          <w:rFonts w:ascii="PalatinoLTPro" w:hAnsi="PalatinoLTPro"/>
+          <w:noProof/>
         </w:rPr>
         <w:drawing>
           <wp:inline distT="0" distB="0" distL="0" distR="0" wp14:anchorId="6619FE8B" wp14:editId="48D25D1D">
@@ -453,17 +1260,300 @@
         <w:t xml:space="preserve">Q8. For the Heartbleed attack, explain how you did the attack, and what your observations are. </w:t>
       </w:r>
     </w:p>
-    <w:p/>
-    <w:p>
-      <w:pPr>
-        <w:pStyle w:val="NormalWeb"/>
-        <w:shd w:val="clear" w:color="auto" w:fill="FFFFFF"/>
+    <w:p>
+      <w:pPr>
+        <w:pStyle w:val="ListParagraph"/>
+        <w:numPr>
+          <w:ilvl w:val="0"/>
+          <w:numId w:val="2"/>
+        </w:numPr>
+        <w:rPr>
+          <w:rFonts w:asciiTheme="majorBidi" w:hAnsiTheme="majorBidi" w:cstheme="majorBidi"/>
+          <w:b/>
+          <w:bCs/>
+          <w:color w:val="0070C0"/>
+          <w:sz w:val="32"/>
+          <w:szCs w:val="32"/>
+          <w:cs/>
+          <w:lang w:val="en-US"/>
+        </w:rPr>
+      </w:pPr>
+      <w:r>
+        <w:rPr>
+          <w:rFonts w:asciiTheme="majorBidi" w:hAnsiTheme="majorBidi" w:cstheme="majorBidi"/>
+          <w:b/>
+          <w:bCs/>
+          <w:color w:val="0070C0"/>
+          <w:sz w:val="32"/>
+          <w:szCs w:val="32"/>
+          <w:cs/>
+        </w:rPr>
+        <w:t xml:space="preserve">เมื่อลองทำการ </w:t>
+      </w:r>
+      <w:r>
+        <w:rPr>
+          <w:rFonts w:asciiTheme="majorBidi" w:hAnsiTheme="majorBidi" w:cstheme="majorBidi"/>
+          <w:b/>
+          <w:bCs/>
+          <w:i/>
+          <w:iCs/>
+          <w:color w:val="0070C0"/>
+          <w:sz w:val="32"/>
+          <w:szCs w:val="32"/>
+          <w:lang w:val="en-US"/>
+        </w:rPr>
+        <w:t>run attack.py</w:t>
+      </w:r>
+      <w:r>
+        <w:rPr>
+          <w:rFonts w:asciiTheme="majorBidi" w:hAnsiTheme="majorBidi" w:cstheme="majorBidi"/>
+          <w:b/>
+          <w:bCs/>
+          <w:color w:val="0070C0"/>
+          <w:sz w:val="32"/>
+          <w:szCs w:val="32"/>
+          <w:lang w:val="en-US"/>
+        </w:rPr>
+        <w:t xml:space="preserve"> </w:t>
+      </w:r>
+      <w:r>
+        <w:rPr>
+          <w:rFonts w:asciiTheme="majorBidi" w:hAnsiTheme="majorBidi" w:cstheme="majorBidi"/>
+          <w:b/>
+          <w:bCs/>
+          <w:color w:val="0070C0"/>
+          <w:sz w:val="32"/>
+          <w:szCs w:val="32"/>
+          <w:cs/>
+          <w:lang w:val="en-US"/>
+        </w:rPr>
+        <w:t xml:space="preserve">หลาย ๆ ครั้งจะมี </w:t>
+      </w:r>
+      <w:r>
+        <w:rPr>
+          <w:rFonts w:asciiTheme="majorBidi" w:hAnsiTheme="majorBidi" w:cstheme="majorBidi"/>
+          <w:b/>
+          <w:bCs/>
+          <w:color w:val="0070C0"/>
+          <w:sz w:val="32"/>
+          <w:szCs w:val="32"/>
+          <w:lang w:val="en-US"/>
+        </w:rPr>
+        <w:t xml:space="preserve">output </w:t>
+      </w:r>
+      <w:r>
+        <w:rPr>
+          <w:rFonts w:asciiTheme="majorBidi" w:hAnsiTheme="majorBidi" w:cstheme="majorBidi"/>
+          <w:b/>
+          <w:bCs/>
+          <w:color w:val="0070C0"/>
+          <w:sz w:val="32"/>
+          <w:szCs w:val="32"/>
+          <w:cs/>
+          <w:lang w:val="en-US"/>
+        </w:rPr>
+        <w:t xml:space="preserve">ออกมาซึ่งเป็นข้อมูลที่หลุดจาก </w:t>
+      </w:r>
+      <w:r>
+        <w:rPr>
+          <w:rFonts w:asciiTheme="majorBidi" w:hAnsiTheme="majorBidi" w:cstheme="majorBidi"/>
+          <w:b/>
+          <w:bCs/>
+          <w:color w:val="0070C0"/>
+          <w:sz w:val="32"/>
+          <w:szCs w:val="32"/>
+          <w:lang w:val="en-US"/>
+        </w:rPr>
+        <w:t xml:space="preserve">server </w:t>
+      </w:r>
+      <w:r>
+        <w:rPr>
+          <w:rFonts w:asciiTheme="majorBidi" w:hAnsiTheme="majorBidi" w:cstheme="majorBidi"/>
+          <w:b/>
+          <w:bCs/>
+          <w:color w:val="0070C0"/>
+          <w:sz w:val="32"/>
+          <w:szCs w:val="32"/>
+          <w:cs/>
+          <w:lang w:val="en-US"/>
+        </w:rPr>
+        <w:t>และผลลัพธ์จะเริ่ม</w:t>
+      </w:r>
+      <w:r>
+        <w:rPr>
+          <w:rFonts w:asciiTheme="majorBidi" w:hAnsiTheme="majorBidi" w:cstheme="majorBidi" w:hint="cs"/>
+          <w:b/>
+          <w:bCs/>
+          <w:color w:val="0070C0"/>
+          <w:sz w:val="32"/>
+          <w:szCs w:val="32"/>
+          <w:cs/>
+          <w:lang w:val="en-US"/>
+        </w:rPr>
+        <w:t>ออ</w:t>
+      </w:r>
+      <w:r>
+        <w:rPr>
+          <w:rFonts w:asciiTheme="majorBidi" w:hAnsiTheme="majorBidi" w:cstheme="majorBidi" w:hint="cs"/>
+          <w:b/>
+          <w:bCs/>
+          <w:color w:val="0070C0"/>
+          <w:sz w:val="32"/>
+          <w:szCs w:val="32"/>
+          <w:cs/>
+          <w:lang w:val="en-US"/>
+        </w:rPr>
+        <w:t>ก</w:t>
+      </w:r>
+      <w:r>
+        <w:rPr>
+          <w:rFonts w:asciiTheme="majorBidi" w:hAnsiTheme="majorBidi" w:cstheme="majorBidi" w:hint="cs"/>
+          <w:b/>
+          <w:bCs/>
+          <w:color w:val="0070C0"/>
+          <w:sz w:val="32"/>
+          <w:szCs w:val="32"/>
+          <w:cs/>
+          <w:lang w:val="en-US"/>
+        </w:rPr>
+        <w:t>ม</w:t>
+      </w:r>
+      <w:r>
+        <w:rPr>
+          <w:rFonts w:asciiTheme="majorBidi" w:hAnsiTheme="majorBidi" w:cstheme="majorBidi"/>
+          <w:b/>
+          <w:bCs/>
+          <w:color w:val="0070C0"/>
+          <w:sz w:val="32"/>
+          <w:szCs w:val="32"/>
+          <w:cs/>
+          <w:lang w:val="en-US"/>
+        </w:rPr>
+        <w:t>า</w:t>
+      </w:r>
+      <w:r>
+        <w:rPr>
+          <w:rFonts w:asciiTheme="majorBidi" w:hAnsiTheme="majorBidi" w:cstheme="majorBidi"/>
+          <w:b/>
+          <w:bCs/>
+          <w:color w:val="0070C0"/>
+          <w:sz w:val="32"/>
+          <w:szCs w:val="32"/>
+          <w:cs/>
+          <w:lang w:val="en-US"/>
+        </w:rPr>
+        <w:t>เวียน</w:t>
+      </w:r>
+      <w:r>
+        <w:rPr>
+          <w:rFonts w:asciiTheme="majorBidi" w:hAnsiTheme="majorBidi" w:cstheme="majorBidi" w:hint="cs"/>
+          <w:b/>
+          <w:bCs/>
+          <w:color w:val="0070C0"/>
+          <w:sz w:val="32"/>
+          <w:szCs w:val="32"/>
+          <w:cs/>
+          <w:lang w:val="en-US"/>
+        </w:rPr>
+        <w:t>ซ้ำ</w:t>
+      </w:r>
+    </w:p>
+    <w:p>
+      <w:pPr>
+        <w:pStyle w:val="NormalWeb"/>
+        <w:shd w:val="clear" w:color="auto" w:fill="FFFFFF"/>
+        <w:rPr>
+          <w:rFonts w:asciiTheme="majorBidi" w:hAnsiTheme="majorBidi" w:cstheme="majorBidi"/>
+          <w:sz w:val="32"/>
+          <w:szCs w:val="32"/>
+        </w:rPr>
+      </w:pPr>
+    </w:p>
+    <w:p>
+      <w:pPr>
+        <w:pStyle w:val="NormalWeb"/>
+        <w:shd w:val="clear" w:color="auto" w:fill="FFFFFF"/>
+        <w:rPr>
+          <w:rFonts w:ascii="PalatinoLTPro" w:hAnsi="PalatinoLTPro" w:cstheme="minorBidi"/>
+        </w:rPr>
+      </w:pPr>
+    </w:p>
+    <w:p>
+      <w:pPr>
+        <w:pStyle w:val="NormalWeb"/>
+        <w:shd w:val="clear" w:color="auto" w:fill="FFFFFF"/>
+        <w:rPr>
+          <w:rFonts w:ascii="PalatinoLTPro" w:hAnsi="PalatinoLTPro" w:cstheme="minorBidi"/>
+        </w:rPr>
+      </w:pPr>
+    </w:p>
+    <w:p>
+      <w:pPr>
+        <w:pStyle w:val="NormalWeb"/>
+        <w:shd w:val="clear" w:color="auto" w:fill="FFFFFF"/>
+        <w:rPr>
+          <w:rFonts w:ascii="PalatinoLTPro" w:hAnsi="PalatinoLTPro" w:cstheme="minorBidi"/>
+        </w:rPr>
       </w:pPr>
       <w:r>
         <w:rPr>
           <w:rFonts w:ascii="PalatinoLTPro" w:hAnsi="PalatinoLTPro"/>
         </w:rPr>
+        <w:lastRenderedPageBreak/>
         <w:t xml:space="preserve">Q9: As the length variable decreases, what kind of difference can you observe? </w:t>
+      </w:r>
+    </w:p>
+    <w:p>
+      <w:pPr>
+        <w:pStyle w:val="NormalWeb"/>
+        <w:numPr>
+          <w:ilvl w:val="0"/>
+          <w:numId w:val="2"/>
+        </w:numPr>
+        <w:shd w:val="clear" w:color="auto" w:fill="FFFFFF"/>
+        <w:rPr>
+          <w:rFonts w:asciiTheme="majorBidi" w:hAnsiTheme="majorBidi" w:cstheme="majorBidi"/>
+          <w:b/>
+          <w:bCs/>
+          <w:color w:val="0070C0"/>
+          <w:sz w:val="32"/>
+          <w:szCs w:val="32"/>
+        </w:rPr>
+      </w:pPr>
+      <w:r>
+        <w:rPr>
+          <w:rFonts w:asciiTheme="majorBidi" w:hAnsiTheme="majorBidi" w:cstheme="majorBidi"/>
+          <w:b/>
+          <w:bCs/>
+          <w:color w:val="0070C0"/>
+          <w:sz w:val="32"/>
+          <w:szCs w:val="32"/>
+          <w:cs/>
+        </w:rPr>
+        <w:t xml:space="preserve">เมื่อ </w:t>
+      </w:r>
+      <w:r>
+        <w:rPr>
+          <w:rFonts w:asciiTheme="majorBidi" w:hAnsiTheme="majorBidi" w:cstheme="majorBidi"/>
+          <w:b/>
+          <w:bCs/>
+          <w:color w:val="0070C0"/>
+          <w:sz w:val="32"/>
+          <w:szCs w:val="32"/>
+        </w:rPr>
+        <w:t xml:space="preserve">length variable </w:t>
+      </w:r>
+      <w:r>
+        <w:rPr>
+          <w:rFonts w:asciiTheme="majorBidi" w:hAnsiTheme="majorBidi" w:cstheme="majorBidi"/>
+          <w:b/>
+          <w:bCs/>
+          <w:color w:val="0070C0"/>
+          <w:sz w:val="32"/>
+          <w:szCs w:val="32"/>
+          <w:cs/>
+        </w:rPr>
+        <w:t>ลด ผลลัพธ์จะค่อย ๆ สั้นลง</w:t>
       </w:r>
     </w:p>
     <w:p>
@@ -476,9 +1566,9 @@
       <w:r>
         <w:rPr>
           <w:rFonts w:ascii="PalatinoLTPro" w:eastAsia="Times New Roman" w:hAnsi="PalatinoLTPro" w:cs="Times New Roman"/>
+          <w:noProof/>
           <w:szCs w:val="24"/>
         </w:rPr>
-        <w:lastRenderedPageBreak/>
         <w:drawing>
           <wp:inline distT="0" distB="0" distL="0" distR="0" wp14:anchorId="65681A90" wp14:editId="6E0F8DFC">
             <wp:extent cx="5943600" cy="3116580"/>
@@ -520,17 +1610,201 @@
       <w:pPr>
         <w:pStyle w:val="NormalWeb"/>
         <w:shd w:val="clear" w:color="auto" w:fill="FFFFFF"/>
-      </w:pPr>
-      <w:r>
         <w:rPr>
           <w:rFonts w:ascii="PalatinoLTPro" w:hAnsi="PalatinoLTPro"/>
         </w:rPr>
+      </w:pPr>
+    </w:p>
+    <w:p>
+      <w:pPr>
+        <w:rPr>
+          <w:rFonts w:ascii="PalatinoLTPro" w:eastAsia="Times New Roman" w:hAnsi="PalatinoLTPro" w:cs="Times New Roman"/>
+          <w:szCs w:val="24"/>
+        </w:rPr>
+      </w:pPr>
+      <w:r>
+        <w:rPr>
+          <w:rFonts w:ascii="PalatinoLTPro" w:hAnsi="PalatinoLTPro"/>
+        </w:rPr>
+        <w:br w:type="page"/>
+      </w:r>
+    </w:p>
+    <w:p>
+      <w:pPr>
+        <w:pStyle w:val="NormalWeb"/>
+        <w:shd w:val="clear" w:color="auto" w:fill="FFFFFF"/>
+        <w:rPr>
+          <w:rFonts w:ascii="PalatinoLTPro" w:hAnsi="PalatinoLTPro" w:cstheme="minorBidi"/>
+        </w:rPr>
+      </w:pPr>
+      <w:r>
+        <w:rPr>
+          <w:rFonts w:ascii="PalatinoLTPro" w:hAnsi="PalatinoLTPro"/>
+        </w:rPr>
+        <w:lastRenderedPageBreak/>
         <w:t xml:space="preserve">Q10: As the length variable decreases, there is a boundary value for the input length variable. At or below that boundary, the Heartbeat query will receive a response packet without attaching any extra data (which means the request is benign). Please find that boundary length. You may need to try many different length values until the web server sends back the reply without extra data. To help you with this, when the number of returned bytes is smaller than the expected length, the program will print "Server processed malformed Heartbeat, but did not return any extra data." What is the boundary length? </w:t>
       </w:r>
     </w:p>
+    <w:p>
+      <w:pPr>
+        <w:pStyle w:val="NormalWeb"/>
+        <w:numPr>
+          <w:ilvl w:val="0"/>
+          <w:numId w:val="2"/>
+        </w:numPr>
+        <w:shd w:val="clear" w:color="auto" w:fill="FFFFFF"/>
+        <w:rPr>
+          <w:rFonts w:asciiTheme="majorBidi" w:hAnsiTheme="majorBidi" w:cstheme="majorBidi"/>
+          <w:b/>
+          <w:bCs/>
+          <w:color w:val="0070C0"/>
+          <w:sz w:val="32"/>
+          <w:szCs w:val="32"/>
+          <w:lang w:val="en-US"/>
+        </w:rPr>
+      </w:pPr>
+      <w:r>
+        <w:rPr>
+          <w:rFonts w:asciiTheme="majorBidi" w:hAnsiTheme="majorBidi" w:cstheme="majorBidi"/>
+          <w:b/>
+          <w:bCs/>
+          <w:color w:val="0070C0"/>
+          <w:sz w:val="32"/>
+          <w:szCs w:val="32"/>
+          <w:cs/>
+        </w:rPr>
+        <w:t xml:space="preserve">จากการลองทำโดยลดไปเรื่อย ๆ พบว่า </w:t>
+      </w:r>
+      <w:r>
+        <w:rPr>
+          <w:rFonts w:asciiTheme="majorBidi" w:hAnsiTheme="majorBidi" w:cstheme="majorBidi"/>
+          <w:b/>
+          <w:bCs/>
+          <w:color w:val="0070C0"/>
+          <w:sz w:val="32"/>
+          <w:szCs w:val="32"/>
+        </w:rPr>
+        <w:t>boundary length</w:t>
+      </w:r>
+      <w:r>
+        <w:rPr>
+          <w:rFonts w:asciiTheme="majorBidi" w:hAnsiTheme="majorBidi" w:cstheme="majorBidi"/>
+          <w:b/>
+          <w:bCs/>
+          <w:color w:val="0070C0"/>
+          <w:sz w:val="32"/>
+          <w:szCs w:val="32"/>
+          <w:cs/>
+        </w:rPr>
+        <w:t xml:space="preserve"> คือ </w:t>
+      </w:r>
+      <w:r>
+        <w:rPr>
+          <w:rFonts w:asciiTheme="majorBidi" w:hAnsiTheme="majorBidi" w:cstheme="majorBidi"/>
+          <w:b/>
+          <w:bCs/>
+          <w:color w:val="0070C0"/>
+          <w:sz w:val="32"/>
+          <w:szCs w:val="32"/>
+          <w:lang w:val="en-US"/>
+        </w:rPr>
+        <w:t xml:space="preserve">23 </w:t>
+      </w:r>
+      <w:r>
+        <w:rPr>
+          <w:rFonts w:asciiTheme="majorBidi" w:hAnsiTheme="majorBidi" w:cstheme="majorBidi"/>
+          <w:b/>
+          <w:bCs/>
+          <w:color w:val="0070C0"/>
+          <w:sz w:val="32"/>
+          <w:szCs w:val="32"/>
+          <w:cs/>
+          <w:lang w:val="en-US"/>
+        </w:rPr>
+        <w:t xml:space="preserve">เพราะเมื่อ </w:t>
+      </w:r>
+      <w:r>
+        <w:rPr>
+          <w:rFonts w:asciiTheme="majorBidi" w:hAnsiTheme="majorBidi" w:cstheme="majorBidi"/>
+          <w:b/>
+          <w:bCs/>
+          <w:color w:val="0070C0"/>
+          <w:sz w:val="32"/>
+          <w:szCs w:val="32"/>
+          <w:lang w:val="en-US"/>
+        </w:rPr>
+        <w:t xml:space="preserve">assign </w:t>
+      </w:r>
+      <w:r>
+        <w:rPr>
+          <w:rFonts w:asciiTheme="majorBidi" w:hAnsiTheme="majorBidi" w:cstheme="majorBidi"/>
+          <w:b/>
+          <w:bCs/>
+          <w:color w:val="0070C0"/>
+          <w:sz w:val="32"/>
+          <w:szCs w:val="32"/>
+          <w:cs/>
+          <w:lang w:val="en-US"/>
+        </w:rPr>
+        <w:t xml:space="preserve">ค่าเป็น </w:t>
+      </w:r>
+      <w:r>
+        <w:rPr>
+          <w:rFonts w:asciiTheme="majorBidi" w:hAnsiTheme="majorBidi" w:cstheme="majorBidi"/>
+          <w:b/>
+          <w:bCs/>
+          <w:color w:val="0070C0"/>
+          <w:sz w:val="32"/>
+          <w:szCs w:val="32"/>
+          <w:lang w:val="en-US"/>
+        </w:rPr>
+        <w:t xml:space="preserve">22 </w:t>
+      </w:r>
+      <w:r>
+        <w:rPr>
+          <w:rFonts w:asciiTheme="majorBidi" w:hAnsiTheme="majorBidi" w:cstheme="majorBidi"/>
+          <w:b/>
+          <w:bCs/>
+          <w:color w:val="0070C0"/>
+          <w:sz w:val="32"/>
+          <w:szCs w:val="32"/>
+          <w:cs/>
+          <w:lang w:val="en-US"/>
+        </w:rPr>
+        <w:t xml:space="preserve">หรือต่ำกว่าจะแสดงค่าแค่ </w:t>
+      </w:r>
+      <w:r>
+        <w:rPr>
+          <w:rFonts w:asciiTheme="majorBidi" w:hAnsiTheme="majorBidi" w:cstheme="majorBidi"/>
+          <w:b/>
+          <w:bCs/>
+          <w:color w:val="0070C0"/>
+          <w:sz w:val="32"/>
+          <w:szCs w:val="32"/>
+          <w:lang w:val="en-US"/>
+        </w:rPr>
+        <w:t>.F</w:t>
+      </w:r>
+      <w:r>
+        <w:rPr>
+          <w:rFonts w:asciiTheme="majorBidi" w:hAnsiTheme="majorBidi" w:cstheme="majorBidi"/>
+          <w:b/>
+          <w:bCs/>
+          <w:color w:val="0070C0"/>
+          <w:sz w:val="32"/>
+          <w:szCs w:val="32"/>
+          <w:cs/>
+          <w:lang w:val="en-US"/>
+        </w:rPr>
+        <w:t xml:space="preserve"> </w:t>
+      </w:r>
+    </w:p>
     <w:p/>
     <w:p>
       <w:r>
+        <w:rPr>
+          <w:noProof/>
+        </w:rPr>
         <w:drawing>
           <wp:inline distT="0" distB="0" distL="0" distR="0" wp14:anchorId="21D1D364" wp14:editId="5D68C291">
             <wp:extent cx="5943600" cy="2720340"/>
@@ -571,7 +1845,9 @@
     <w:p/>
     <w:p>
       <w:r>
-        <w:lastRenderedPageBreak/>
+        <w:rPr>
+          <w:noProof/>
+        </w:rPr>
         <w:drawing>
           <wp:inline distT="0" distB="0" distL="0" distR="0" wp14:anchorId="4A4FD51B" wp14:editId="7155C21C">
             <wp:extent cx="5943600" cy="2519045"/>
@@ -609,8 +1885,6 @@
         </w:drawing>
       </w:r>
     </w:p>
-    <w:p/>
-    <w:p/>
     <w:p>
       <w:pPr>
         <w:pStyle w:val="NormalWeb"/>
@@ -620,10 +1894,47 @@
         <w:rPr>
           <w:rFonts w:ascii="PalatinoLTPro" w:hAnsi="PalatinoLTPro"/>
         </w:rPr>
+        <w:lastRenderedPageBreak/>
         <w:t xml:space="preserve">Q11. Try your attack again after you have updated the OpenSSL library. Are you successful at stealing data from the server after the upgrade? </w:t>
       </w:r>
     </w:p>
-    <w:p/>
+    <w:p>
+      <w:pPr>
+        <w:pStyle w:val="ListParagraph"/>
+        <w:numPr>
+          <w:ilvl w:val="0"/>
+          <w:numId w:val="2"/>
+        </w:numPr>
+        <w:rPr>
+          <w:b/>
+          <w:bCs/>
+          <w:color w:val="0070C0"/>
+          <w:sz w:val="32"/>
+          <w:szCs w:val="32"/>
+        </w:rPr>
+      </w:pPr>
+      <w:r>
+        <w:rPr>
+          <w:rFonts w:hint="cs"/>
+          <w:b/>
+          <w:bCs/>
+          <w:color w:val="0070C0"/>
+          <w:sz w:val="32"/>
+          <w:szCs w:val="32"/>
+          <w:cs/>
+        </w:rPr>
+        <w:t>ไม่สำเร็จในการขโมยข้อมูล</w:t>
+      </w:r>
+    </w:p>
+    <w:p>
+      <w:pPr>
+        <w:rPr>
+          <w:b/>
+          <w:bCs/>
+          <w:cs/>
+        </w:rPr>
+      </w:pPr>
+    </w:p>
     <w:p>
       <w:pPr>
         <w:pStyle w:val="NormalWeb"/>
@@ -642,22 +1953,273 @@
     <w:p>
       <w:pPr>
         <w:pStyle w:val="NormalWeb"/>
-        <w:shd w:val="clear" w:color="auto" w:fill="FFFFFF"/>
-      </w:pPr>
-    </w:p>
-    <w:p>
-      <w:pPr>
-        <w:pStyle w:val="NormalWeb"/>
-        <w:shd w:val="clear" w:color="auto" w:fill="FFFFFF"/>
-      </w:pPr>
-      <w:r>
+        <w:numPr>
+          <w:ilvl w:val="0"/>
+          <w:numId w:val="2"/>
+        </w:numPr>
+        <w:shd w:val="clear" w:color="auto" w:fill="FFFFFF"/>
+        <w:rPr>
+          <w:rFonts w:asciiTheme="majorBidi" w:hAnsiTheme="majorBidi" w:cstheme="majorBidi"/>
+          <w:b/>
+          <w:bCs/>
+          <w:color w:val="0070C0"/>
+          <w:sz w:val="32"/>
+          <w:szCs w:val="32"/>
+          <w:lang w:val="en-US"/>
+        </w:rPr>
+      </w:pPr>
+      <w:r>
+        <w:rPr>
+          <w:rFonts w:asciiTheme="majorBidi" w:hAnsiTheme="majorBidi" w:cstheme="majorBidi"/>
+          <w:b/>
+          <w:bCs/>
+          <w:color w:val="0070C0"/>
+          <w:sz w:val="32"/>
+          <w:szCs w:val="32"/>
+          <w:lang w:val="en-US"/>
+        </w:rPr>
+        <w:t xml:space="preserve">Code </w:t>
+      </w:r>
+      <w:r>
+        <w:rPr>
+          <w:rFonts w:asciiTheme="majorBidi" w:hAnsiTheme="majorBidi" w:cstheme="majorBidi"/>
+          <w:b/>
+          <w:bCs/>
+          <w:color w:val="0070C0"/>
+          <w:sz w:val="32"/>
+          <w:szCs w:val="32"/>
+          <w:cs/>
+          <w:lang w:val="en-US"/>
+        </w:rPr>
+        <w:t xml:space="preserve">ผิดที่บรรทัด </w:t>
+      </w:r>
+      <w:r>
+        <w:rPr>
+          <w:rFonts w:asciiTheme="majorBidi" w:hAnsiTheme="majorBidi" w:cstheme="majorBidi"/>
+          <w:b/>
+          <w:bCs/>
+          <w:color w:val="0070C0"/>
+          <w:sz w:val="32"/>
+          <w:szCs w:val="32"/>
+          <w:lang w:val="en-US"/>
+        </w:rPr>
+        <w:t xml:space="preserve">17 </w:t>
+      </w:r>
+      <w:r>
+        <w:rPr>
+          <w:rFonts w:asciiTheme="majorBidi" w:hAnsiTheme="majorBidi" w:cstheme="majorBidi"/>
+          <w:b/>
+          <w:bCs/>
+          <w:color w:val="0070C0"/>
+          <w:sz w:val="32"/>
+          <w:szCs w:val="32"/>
+          <w:cs/>
+          <w:lang w:val="en-US"/>
+        </w:rPr>
+        <w:t xml:space="preserve">เนื่องจากควรตรวจสอบค่าความยาวใน </w:t>
+      </w:r>
+      <w:r>
+        <w:rPr>
+          <w:rFonts w:asciiTheme="majorBidi" w:hAnsiTheme="majorBidi" w:cstheme="majorBidi"/>
+          <w:b/>
+          <w:bCs/>
+          <w:color w:val="0070C0"/>
+          <w:sz w:val="32"/>
+          <w:szCs w:val="32"/>
+          <w:lang w:val="en-US"/>
+        </w:rPr>
+        <w:t>client request</w:t>
+      </w:r>
+    </w:p>
+    <w:p>
+      <w:pPr>
+        <w:pStyle w:val="NormalWeb"/>
+        <w:shd w:val="clear" w:color="auto" w:fill="FFFFFF"/>
         <w:rPr>
           <w:rFonts w:ascii="PalatinoLTPro" w:hAnsi="PalatinoLTPro"/>
         </w:rPr>
+      </w:pPr>
+    </w:p>
+    <w:p>
+      <w:pPr>
+        <w:pStyle w:val="NormalWeb"/>
+        <w:shd w:val="clear" w:color="auto" w:fill="FFFFFF"/>
+      </w:pPr>
+      <w:r>
+        <w:rPr>
+          <w:rFonts w:ascii="PalatinoLTPro" w:hAnsi="PalatinoLTPro"/>
+        </w:rPr>
         <w:t xml:space="preserve">Q13. Comment on the following discussions by Alice, Bob, and Eva regarding the fundamental cause of the Heartbleed vulnerability: Alice thinks the fundamental cause is missing the boundary checking during the buffer copy; Bob thinks the cause is missing the user input validation; Eva thinks that we can just delete the length value from the packet to solve everything. Who do you agree and disagree with, and why? </w:t>
       </w:r>
     </w:p>
-    <w:p/>
+    <w:p>
+      <w:pPr>
+        <w:pStyle w:val="ListParagraph"/>
+        <w:numPr>
+          <w:ilvl w:val="0"/>
+          <w:numId w:val="2"/>
+        </w:numPr>
+        <w:rPr>
+          <w:rFonts w:asciiTheme="majorBidi" w:hAnsiTheme="majorBidi" w:cstheme="majorBidi"/>
+          <w:b/>
+          <w:bCs/>
+          <w:color w:val="0070C0"/>
+          <w:sz w:val="32"/>
+          <w:szCs w:val="32"/>
+          <w:cs/>
+          <w:lang w:val="en-US"/>
+        </w:rPr>
+      </w:pPr>
+      <w:r>
+        <w:rPr>
+          <w:rFonts w:asciiTheme="majorBidi" w:hAnsiTheme="majorBidi" w:cstheme="majorBidi"/>
+          <w:b/>
+          <w:bCs/>
+          <w:color w:val="0070C0"/>
+          <w:sz w:val="32"/>
+          <w:szCs w:val="32"/>
+          <w:cs/>
+        </w:rPr>
+        <w:t xml:space="preserve">เห็นด้วยกับ </w:t>
+      </w:r>
+      <w:r>
+        <w:rPr>
+          <w:rFonts w:asciiTheme="majorBidi" w:hAnsiTheme="majorBidi" w:cstheme="majorBidi"/>
+          <w:b/>
+          <w:bCs/>
+          <w:color w:val="0070C0"/>
+          <w:sz w:val="32"/>
+          <w:szCs w:val="32"/>
+          <w:lang w:val="en-US"/>
+        </w:rPr>
+        <w:t xml:space="preserve">Alice </w:t>
+      </w:r>
+      <w:r>
+        <w:rPr>
+          <w:rFonts w:asciiTheme="majorBidi" w:hAnsiTheme="majorBidi" w:cstheme="majorBidi"/>
+          <w:b/>
+          <w:bCs/>
+          <w:color w:val="0070C0"/>
+          <w:sz w:val="32"/>
+          <w:szCs w:val="32"/>
+          <w:cs/>
+          <w:lang w:val="en-US"/>
+        </w:rPr>
+        <w:t xml:space="preserve">และ </w:t>
+      </w:r>
+      <w:r>
+        <w:rPr>
+          <w:rFonts w:asciiTheme="majorBidi" w:hAnsiTheme="majorBidi" w:cstheme="majorBidi"/>
+          <w:b/>
+          <w:bCs/>
+          <w:color w:val="0070C0"/>
+          <w:sz w:val="32"/>
+          <w:szCs w:val="32"/>
+          <w:lang w:val="en-US"/>
+        </w:rPr>
+        <w:t xml:space="preserve">Bob </w:t>
+      </w:r>
+      <w:r>
+        <w:rPr>
+          <w:rFonts w:asciiTheme="majorBidi" w:hAnsiTheme="majorBidi" w:cstheme="majorBidi"/>
+          <w:b/>
+          <w:bCs/>
+          <w:color w:val="0070C0"/>
+          <w:sz w:val="32"/>
+          <w:szCs w:val="32"/>
+          <w:cs/>
+          <w:lang w:val="en-US"/>
+        </w:rPr>
+        <w:t xml:space="preserve">เพราะ การตรวจสอบ </w:t>
+      </w:r>
+      <w:r>
+        <w:rPr>
+          <w:rFonts w:asciiTheme="majorBidi" w:hAnsiTheme="majorBidi" w:cstheme="majorBidi"/>
+          <w:b/>
+          <w:bCs/>
+          <w:color w:val="0070C0"/>
+          <w:sz w:val="32"/>
+          <w:szCs w:val="32"/>
+          <w:lang w:val="en-US"/>
+        </w:rPr>
+        <w:t xml:space="preserve">boundary </w:t>
+      </w:r>
+      <w:r>
+        <w:rPr>
+          <w:rFonts w:asciiTheme="majorBidi" w:hAnsiTheme="majorBidi" w:cstheme="majorBidi"/>
+          <w:b/>
+          <w:bCs/>
+          <w:color w:val="0070C0"/>
+          <w:sz w:val="32"/>
+          <w:szCs w:val="32"/>
+          <w:cs/>
+          <w:lang w:val="en-US"/>
+        </w:rPr>
+        <w:t xml:space="preserve">และ </w:t>
+      </w:r>
+      <w:r>
+        <w:rPr>
+          <w:rFonts w:asciiTheme="majorBidi" w:hAnsiTheme="majorBidi" w:cstheme="majorBidi"/>
+          <w:b/>
+          <w:bCs/>
+          <w:color w:val="0070C0"/>
+          <w:sz w:val="32"/>
+          <w:szCs w:val="32"/>
+          <w:lang w:val="en-US"/>
+        </w:rPr>
+        <w:t xml:space="preserve">user input </w:t>
+      </w:r>
+      <w:r>
+        <w:rPr>
+          <w:rFonts w:asciiTheme="majorBidi" w:hAnsiTheme="majorBidi" w:cstheme="majorBidi"/>
+          <w:b/>
+          <w:bCs/>
+          <w:color w:val="0070C0"/>
+          <w:sz w:val="32"/>
+          <w:szCs w:val="32"/>
+          <w:cs/>
+          <w:lang w:val="en-US"/>
+        </w:rPr>
+        <w:t xml:space="preserve">ทำให้ผู้ร้ายที่พยายามใส่ค่าเกิน ไม่สามารถขโมยข้อมูลได้ เพราะระบบได้ทำการตรวจสอบค่าเหล่านั้นแล้วว่าผิดปกติหรือไม่ แต่ไม่เห็นด้วยกับ </w:t>
+      </w:r>
+      <w:r>
+        <w:rPr>
+          <w:rFonts w:asciiTheme="majorBidi" w:hAnsiTheme="majorBidi" w:cstheme="majorBidi"/>
+          <w:b/>
+          <w:bCs/>
+          <w:color w:val="0070C0"/>
+          <w:sz w:val="32"/>
+          <w:szCs w:val="32"/>
+          <w:lang w:val="en-US"/>
+        </w:rPr>
+        <w:t xml:space="preserve">Eva </w:t>
+      </w:r>
+      <w:r>
+        <w:rPr>
+          <w:rFonts w:asciiTheme="majorBidi" w:hAnsiTheme="majorBidi" w:cstheme="majorBidi"/>
+          <w:b/>
+          <w:bCs/>
+          <w:color w:val="0070C0"/>
+          <w:sz w:val="32"/>
+          <w:szCs w:val="32"/>
+          <w:cs/>
+          <w:lang w:val="en-US"/>
+        </w:rPr>
+        <w:t>เพราะ อาจจะทำให้การทำงานนั้นผิดพลาดได้</w:t>
+      </w:r>
+      <w:r>
+        <w:rPr>
+          <w:rFonts w:asciiTheme="majorBidi" w:hAnsiTheme="majorBidi" w:cstheme="majorBidi"/>
+          <w:b/>
+          <w:bCs/>
+          <w:color w:val="0070C0"/>
+          <w:sz w:val="32"/>
+          <w:szCs w:val="32"/>
+          <w:lang w:val="en-US"/>
+        </w:rPr>
+        <w:t xml:space="preserve"> </w:t>
+      </w:r>
+    </w:p>
     <w:sectPr>
       <w:pgSz w:w="12240" w:h="15840"/>
       <w:pgMar w:top="1440" w:right="1440" w:bottom="1440" w:left="1440" w:header="708" w:footer="708" w:gutter="0"/>
@@ -783,8 +2345,123 @@
       </w:pPr>
     </w:lvl>
   </w:abstractNum>
+  <w:abstractNum w:abstractNumId="1" w15:restartNumberingAfterBreak="0">
+    <w:nsid w:val="4F303500"/>
+    <w:multiLevelType w:val="hybridMultilevel"/>
+    <w:tmpl w:val="4CE0C35E"/>
+    <w:lvl w:ilvl="0" w:tplc="8214BD28">
+      <w:numFmt w:val="bullet"/>
+      <w:lvlText w:val="-"/>
+      <w:lvlJc w:val="left"/>
+      <w:pPr>
+        <w:ind w:left="1080" w:hanging="360"/>
+      </w:pPr>
+      <w:rPr>
+        <w:rFonts w:ascii="Angsana New" w:eastAsia="Times New Roman" w:hAnsi="Angsana New" w:cs="Angsana New" w:hint="default"/>
+      </w:rPr>
+    </w:lvl>
+    <w:lvl w:ilvl="1" w:tplc="04090003" w:tentative="1">
+      <w:start w:val="1"/>
+      <w:numFmt w:val="bullet"/>
+      <w:lvlText w:val="o"/>
+      <w:lvlJc w:val="left"/>
+      <w:pPr>
+        <w:ind w:left="1800" w:hanging="360"/>
+      </w:pPr>
+      <w:rPr>
+        <w:rFonts w:ascii="Courier New" w:hAnsi="Courier New" w:cs="Courier New" w:hint="default"/>
+      </w:rPr>
+    </w:lvl>
+    <w:lvl w:ilvl="2" w:tplc="04090005" w:tentative="1">
+      <w:start w:val="1"/>
+      <w:numFmt w:val="bullet"/>
+      <w:lvlText w:val=""/>
+      <w:lvlJc w:val="left"/>
+      <w:pPr>
+        <w:ind w:left="2520" w:hanging="360"/>
+      </w:pPr>
+      <w:rPr>
+        <w:rFonts w:ascii="Wingdings" w:hAnsi="Wingdings" w:hint="default"/>
+      </w:rPr>
+    </w:lvl>
+    <w:lvl w:ilvl="3" w:tplc="04090001" w:tentative="1">
+      <w:start w:val="1"/>
+      <w:numFmt w:val="bullet"/>
+      <w:lvlText w:val=""/>
+      <w:lvlJc w:val="left"/>
+      <w:pPr>
+        <w:ind w:left="3240" w:hanging="360"/>
+      </w:pPr>
+      <w:rPr>
+        <w:rFonts w:ascii="Symbol" w:hAnsi="Symbol" w:hint="default"/>
+      </w:rPr>
+    </w:lvl>
+    <w:lvl w:ilvl="4" w:tplc="04090003" w:tentative="1">
+      <w:start w:val="1"/>
+      <w:numFmt w:val="bullet"/>
+      <w:lvlText w:val="o"/>
+      <w:lvlJc w:val="left"/>
+      <w:pPr>
+        <w:ind w:left="3960" w:hanging="360"/>
+      </w:pPr>
+      <w:rPr>
+        <w:rFonts w:ascii="Courier New" w:hAnsi="Courier New" w:cs="Courier New" w:hint="default"/>
+      </w:rPr>
+    </w:lvl>
+    <w:lvl w:ilvl="5" w:tplc="04090005" w:tentative="1">
+      <w:start w:val="1"/>
+      <w:numFmt w:val="bullet"/>
+      <w:lvlText w:val=""/>
+      <w:lvlJc w:val="left"/>
+      <w:pPr>
+        <w:ind w:left="4680" w:hanging="360"/>
+      </w:pPr>
+      <w:rPr>
+        <w:rFonts w:ascii="Wingdings" w:hAnsi="Wingdings" w:hint="default"/>
+      </w:rPr>
+    </w:lvl>
+    <w:lvl w:ilvl="6" w:tplc="04090001" w:tentative="1">
+      <w:start w:val="1"/>
+      <w:numFmt w:val="bullet"/>
+      <w:lvlText w:val=""/>
+      <w:lvlJc w:val="left"/>
+      <w:pPr>
+        <w:ind w:left="5400" w:hanging="360"/>
+      </w:pPr>
+      <w:rPr>
+        <w:rFonts w:ascii="Symbol" w:hAnsi="Symbol" w:hint="default"/>
+      </w:rPr>
+    </w:lvl>
+    <w:lvl w:ilvl="7" w:tplc="04090003" w:tentative="1">
+      <w:start w:val="1"/>
+      <w:numFmt w:val="bullet"/>
+      <w:lvlText w:val="o"/>
+      <w:lvlJc w:val="left"/>
+      <w:pPr>
+        <w:ind w:left="6120" w:hanging="360"/>
+      </w:pPr>
+      <w:rPr>
+        <w:rFonts w:ascii="Courier New" w:hAnsi="Courier New" w:cs="Courier New" w:hint="default"/>
+      </w:rPr>
+    </w:lvl>
+    <w:lvl w:ilvl="8" w:tplc="04090005" w:tentative="1">
+      <w:start w:val="1"/>
+      <w:numFmt w:val="bullet"/>
+      <w:lvlText w:val=""/>
+      <w:lvlJc w:val="left"/>
+      <w:pPr>
+        <w:ind w:left="6840" w:hanging="360"/>
+      </w:pPr>
+      <w:rPr>
+        <w:rFonts w:ascii="Wingdings" w:hAnsi="Wingdings" w:hint="default"/>
+      </w:rPr>
+    </w:lvl>
+  </w:abstractNum>
   <w:num w:numId="1" w16cid:durableId="1450204518">
     <w:abstractNumId w:val="0"/>
+  </w:num>
+  <w:num w:numId="2" w16cid:durableId="801458485">
+    <w:abstractNumId w:val="1"/>
   </w:num>
 </w:numbering>
 </file>
@@ -1218,7 +2895,6 @@
     <w:name w:val="Normal (Web)"/>
     <w:basedOn w:val="Normal"/>
     <w:uiPriority w:val="99"/>
-    <w:semiHidden/>
     <w:unhideWhenUsed/>
     <w:rsid w:val="00C702B6"/>
     <w:pPr>
@@ -1228,6 +2904,17 @@
       <w:rFonts w:ascii="Times New Roman" w:eastAsia="Times New Roman" w:hAnsi="Times New Roman" w:cs="Times New Roman"/>
       <w:szCs w:val="24"/>
     </w:rPr>
+  </w:style>
+  <w:style w:type="paragraph" w:styleId="ListParagraph">
+    <w:name w:val="List Paragraph"/>
+    <w:basedOn w:val="Normal"/>
+    <w:uiPriority w:val="34"/>
+    <w:qFormat/>
+    <w:rsid w:val="00635F6C"/>
+    <w:pPr>
+      <w:ind w:left="720"/>
+      <w:contextualSpacing/>
+    </w:pPr>
   </w:style>
 </w:styles>
 </file>

</xml_diff>